<commit_message>
docs: finalize KIU interim report with all 13 embedded screenshots and generate compiled docx
</commit_message>
<xml_diff>
--- a/docs/interim_report_complete.docx
+++ b/docs/interim_report_complete.docx
@@ -611,7 +611,7 @@
           <w:color w:val="285078"/>
           <w:sz w:val="28"/>
         </w:rPr>
-        <w:t>Abstract</w:t>
+        <w:t>1. Title Page and Abstract</w:t>
       </w:r>
     </w:p>
     <w:p>
@@ -4889,6 +4889,112 @@
     </w:p>
     <w:p>
       <w:pPr>
+        <w:spacing w:before="200" w:after="80"/>
+        <w:jc w:val="center"/>
+      </w:pPr>
+      <w:r>
+        <w:drawing>
+          <wp:inline xmlns:a="http://schemas.openxmlformats.org/drawingml/2006/main" xmlns:pic="http://schemas.openxmlformats.org/drawingml/2006/picture">
+            <wp:extent cx="5303520" cy="3756660"/>
+            <wp:docPr id="2" name="Picture 2"/>
+            <wp:cNvGraphicFramePr>
+              <a:graphicFrameLocks noChangeAspect="1"/>
+            </wp:cNvGraphicFramePr>
+            <a:graphic>
+              <a:graphicData uri="http://schemas.openxmlformats.org/drawingml/2006/picture">
+                <pic:pic>
+                  <pic:nvPicPr>
+                    <pic:cNvPr id="0" name="docker_ps.png"/>
+                    <pic:cNvPicPr/>
+                  </pic:nvPicPr>
+                  <pic:blipFill>
+                    <a:blip r:embed="rId10"/>
+                    <a:stretch>
+                      <a:fillRect/>
+                    </a:stretch>
+                  </pic:blipFill>
+                  <pic:spPr>
+                    <a:xfrm>
+                      <a:off x="0" y="0"/>
+                      <a:ext cx="5303520" cy="3756660"/>
+                    </a:xfrm>
+                    <a:prstGeom prst="rect"/>
+                  </pic:spPr>
+                </pic:pic>
+              </a:graphicData>
+            </a:graphic>
+          </wp:inline>
+        </w:drawing>
+      </w:r>
+    </w:p>
+    <w:p>
+      <w:pPr>
+        <w:spacing w:after="240"/>
+        <w:jc w:val="center"/>
+      </w:pPr>
+      <w:r>
+        <w:rPr>
+          <w:i/>
+          <w:sz w:val="21"/>
+        </w:rPr>
+        <w:t>Figure 2: Docker CLI terminal logs proving all 12 platform containers are running.</w:t>
+      </w:r>
+    </w:p>
+    <w:p>
+      <w:pPr>
+        <w:spacing w:before="200" w:after="80"/>
+        <w:jc w:val="center"/>
+      </w:pPr>
+      <w:r>
+        <w:drawing>
+          <wp:inline xmlns:a="http://schemas.openxmlformats.org/drawingml/2006/main" xmlns:pic="http://schemas.openxmlformats.org/drawingml/2006/picture">
+            <wp:extent cx="5303520" cy="3756660"/>
+            <wp:docPr id="3" name="Picture 3"/>
+            <wp:cNvGraphicFramePr>
+              <a:graphicFrameLocks noChangeAspect="1"/>
+            </wp:cNvGraphicFramePr>
+            <a:graphic>
+              <a:graphicData uri="http://schemas.openxmlformats.org/drawingml/2006/picture">
+                <pic:pic>
+                  <pic:nvPicPr>
+                    <pic:cNvPr id="0" name="docker_networks.png"/>
+                    <pic:cNvPicPr/>
+                  </pic:nvPicPr>
+                  <pic:blipFill>
+                    <a:blip r:embed="rId11"/>
+                    <a:stretch>
+                      <a:fillRect/>
+                    </a:stretch>
+                  </pic:blipFill>
+                  <pic:spPr>
+                    <a:xfrm>
+                      <a:off x="0" y="0"/>
+                      <a:ext cx="5303520" cy="3756660"/>
+                    </a:xfrm>
+                    <a:prstGeom prst="rect"/>
+                  </pic:spPr>
+                </pic:pic>
+              </a:graphicData>
+            </a:graphic>
+          </wp:inline>
+        </w:drawing>
+      </w:r>
+    </w:p>
+    <w:p>
+      <w:pPr>
+        <w:spacing w:after="240"/>
+        <w:jc w:val="center"/>
+      </w:pPr>
+      <w:r>
+        <w:rPr>
+          <w:i/>
+          <w:sz w:val="21"/>
+        </w:rPr>
+        <w:t>Figure 3: Docker networks list showing isolated ot-network, iot-network, and dmz-network subnets.</w:t>
+      </w:r>
+    </w:p>
+    <w:p>
+      <w:pPr>
         <w:keepNext/>
         <w:spacing w:before="200" w:after="120"/>
       </w:pPr>
@@ -4980,6 +5086,112 @@
     </w:p>
     <w:p>
       <w:pPr>
+        <w:spacing w:before="200" w:after="80"/>
+        <w:jc w:val="center"/>
+      </w:pPr>
+      <w:r>
+        <w:drawing>
+          <wp:inline xmlns:a="http://schemas.openxmlformats.org/drawingml/2006/main" xmlns:pic="http://schemas.openxmlformats.org/drawingml/2006/picture">
+            <wp:extent cx="5303520" cy="3756660"/>
+            <wp:docPr id="4" name="Picture 4"/>
+            <wp:cNvGraphicFramePr>
+              <a:graphicFrameLocks noChangeAspect="1"/>
+            </wp:cNvGraphicFramePr>
+            <a:graphic>
+              <a:graphicData uri="http://schemas.openxmlformats.org/drawingml/2006/picture">
+                <pic:pic>
+                  <pic:nvPicPr>
+                    <pic:cNvPr id="0" name="traffic_capture_log.png"/>
+                    <pic:cNvPicPr/>
+                  </pic:nvPicPr>
+                  <pic:blipFill>
+                    <a:blip r:embed="rId12"/>
+                    <a:stretch>
+                      <a:fillRect/>
+                    </a:stretch>
+                  </pic:blipFill>
+                  <pic:spPr>
+                    <a:xfrm>
+                      <a:off x="0" y="0"/>
+                      <a:ext cx="5303520" cy="3756660"/>
+                    </a:xfrm>
+                    <a:prstGeom prst="rect"/>
+                  </pic:spPr>
+                </pic:pic>
+              </a:graphicData>
+            </a:graphic>
+          </wp:inline>
+        </w:drawing>
+      </w:r>
+    </w:p>
+    <w:p>
+      <w:pPr>
+        <w:spacing w:after="240"/>
+        <w:jc w:val="center"/>
+      </w:pPr>
+      <w:r>
+        <w:rPr>
+          <w:i/>
+          <w:sz w:val="21"/>
+        </w:rPr>
+        <w:t>Figure 4: Real-time traffic capture console output displaying sliding feature extraction logs.</w:t>
+      </w:r>
+    </w:p>
+    <w:p>
+      <w:pPr>
+        <w:spacing w:before="200" w:after="80"/>
+        <w:jc w:val="center"/>
+      </w:pPr>
+      <w:r>
+        <w:drawing>
+          <wp:inline xmlns:a="http://schemas.openxmlformats.org/drawingml/2006/main" xmlns:pic="http://schemas.openxmlformats.org/drawingml/2006/picture">
+            <wp:extent cx="5303520" cy="3756660"/>
+            <wp:docPr id="5" name="Picture 5"/>
+            <wp:cNvGraphicFramePr>
+              <a:graphicFrameLocks noChangeAspect="1"/>
+            </wp:cNvGraphicFramePr>
+            <a:graphic>
+              <a:graphicData uri="http://schemas.openxmlformats.org/drawingml/2006/picture">
+                <pic:pic>
+                  <pic:nvPicPr>
+                    <pic:cNvPr id="0" name="dataset_csv.png"/>
+                    <pic:cNvPicPr/>
+                  </pic:nvPicPr>
+                  <pic:blipFill>
+                    <a:blip r:embed="rId13"/>
+                    <a:stretch>
+                      <a:fillRect/>
+                    </a:stretch>
+                  </pic:blipFill>
+                  <pic:spPr>
+                    <a:xfrm>
+                      <a:off x="0" y="0"/>
+                      <a:ext cx="5303520" cy="3756660"/>
+                    </a:xfrm>
+                    <a:prstGeom prst="rect"/>
+                  </pic:spPr>
+                </pic:pic>
+              </a:graphicData>
+            </a:graphic>
+          </wp:inline>
+        </w:drawing>
+      </w:r>
+    </w:p>
+    <w:p>
+      <w:pPr>
+        <w:spacing w:after="240"/>
+        <w:jc w:val="center"/>
+      </w:pPr>
+      <w:r>
+        <w:rPr>
+          <w:i/>
+          <w:sz w:val="21"/>
+        </w:rPr>
+        <w:t>Figure 5: SQLite database configuration showing clustering_dataset.csv feature table schema.</w:t>
+      </w:r>
+    </w:p>
+    <w:p>
+      <w:pPr>
         <w:keepNext/>
         <w:spacing w:before="200" w:after="120"/>
       </w:pPr>
@@ -5083,6 +5295,112 @@
     </w:p>
     <w:p>
       <w:pPr>
+        <w:spacing w:before="200" w:after="80"/>
+        <w:jc w:val="center"/>
+      </w:pPr>
+      <w:r>
+        <w:drawing>
+          <wp:inline xmlns:a="http://schemas.openxmlformats.org/drawingml/2006/main" xmlns:pic="http://schemas.openxmlformats.org/drawingml/2006/picture">
+            <wp:extent cx="5303520" cy="3756660"/>
+            <wp:docPr id="6" name="Picture 6"/>
+            <wp:cNvGraphicFramePr>
+              <a:graphicFrameLocks noChangeAspect="1"/>
+            </wp:cNvGraphicFramePr>
+            <a:graphic>
+              <a:graphicData uri="http://schemas.openxmlformats.org/drawingml/2006/picture">
+                <pic:pic>
+                  <pic:nvPicPr>
+                    <pic:cNvPr id="0" name="ml_train_console.png"/>
+                    <pic:cNvPicPr/>
+                  </pic:nvPicPr>
+                  <pic:blipFill>
+                    <a:blip r:embed="rId14"/>
+                    <a:stretch>
+                      <a:fillRect/>
+                    </a:stretch>
+                  </pic:blipFill>
+                  <pic:spPr>
+                    <a:xfrm>
+                      <a:off x="0" y="0"/>
+                      <a:ext cx="5303520" cy="3756660"/>
+                    </a:xfrm>
+                    <a:prstGeom prst="rect"/>
+                  </pic:spPr>
+                </pic:pic>
+              </a:graphicData>
+            </a:graphic>
+          </wp:inline>
+        </w:drawing>
+      </w:r>
+    </w:p>
+    <w:p>
+      <w:pPr>
+        <w:spacing w:after="240"/>
+        <w:jc w:val="center"/>
+      </w:pPr>
+      <w:r>
+        <w:rPr>
+          <w:i/>
+          <w:sz w:val="21"/>
+        </w:rPr>
+        <w:t>Figure 6: Console logs showing training of Isolation Forest and DBSCAN algorithms.</w:t>
+      </w:r>
+    </w:p>
+    <w:p>
+      <w:pPr>
+        <w:spacing w:before="200" w:after="80"/>
+        <w:jc w:val="center"/>
+      </w:pPr>
+      <w:r>
+        <w:drawing>
+          <wp:inline xmlns:a="http://schemas.openxmlformats.org/drawingml/2006/main" xmlns:pic="http://schemas.openxmlformats.org/drawingml/2006/picture">
+            <wp:extent cx="5303520" cy="2651760"/>
+            <wp:docPr id="7" name="Picture 7"/>
+            <wp:cNvGraphicFramePr>
+              <a:graphicFrameLocks noChangeAspect="1"/>
+            </wp:cNvGraphicFramePr>
+            <a:graphic>
+              <a:graphicData uri="http://schemas.openxmlformats.org/drawingml/2006/picture">
+                <pic:pic>
+                  <pic:nvPicPr>
+                    <pic:cNvPr id="0" name="fig_device_scores.png"/>
+                    <pic:cNvPicPr/>
+                  </pic:nvPicPr>
+                  <pic:blipFill>
+                    <a:blip r:embed="rId15"/>
+                    <a:stretch>
+                      <a:fillRect/>
+                    </a:stretch>
+                  </pic:blipFill>
+                  <pic:spPr>
+                    <a:xfrm>
+                      <a:off x="0" y="0"/>
+                      <a:ext cx="5303520" cy="2651760"/>
+                    </a:xfrm>
+                    <a:prstGeom prst="rect"/>
+                  </pic:spPr>
+                </pic:pic>
+              </a:graphicData>
+            </a:graphic>
+          </wp:inline>
+        </w:drawing>
+      </w:r>
+    </w:p>
+    <w:p>
+      <w:pPr>
+        <w:spacing w:after="240"/>
+        <w:jc w:val="center"/>
+      </w:pPr>
+      <w:r>
+        <w:rPr>
+          <w:i/>
+          <w:sz w:val="21"/>
+        </w:rPr>
+        <w:t>Figure 13: Ensemble anomaly scores comparison showing clear classification separation.</w:t>
+      </w:r>
+    </w:p>
+    <w:p>
+      <w:pPr>
         <w:keepNext/>
         <w:spacing w:before="200" w:after="120"/>
       </w:pPr>
@@ -5253,6 +5571,59 @@
     </w:p>
     <w:p>
       <w:pPr>
+        <w:spacing w:before="200" w:after="80"/>
+        <w:jc w:val="center"/>
+      </w:pPr>
+      <w:r>
+        <w:drawing>
+          <wp:inline xmlns:a="http://schemas.openxmlformats.org/drawingml/2006/main" xmlns:pic="http://schemas.openxmlformats.org/drawingml/2006/picture">
+            <wp:extent cx="5303520" cy="3756660"/>
+            <wp:docPr id="8" name="Picture 8"/>
+            <wp:cNvGraphicFramePr>
+              <a:graphicFrameLocks noChangeAspect="1"/>
+            </wp:cNvGraphicFramePr>
+            <a:graphic>
+              <a:graphicData uri="http://schemas.openxmlformats.org/drawingml/2006/picture">
+                <pic:pic>
+                  <pic:nvPicPr>
+                    <pic:cNvPr id="0" name="isolator_test_console.png"/>
+                    <pic:cNvPicPr/>
+                  </pic:nvPicPr>
+                  <pic:blipFill>
+                    <a:blip r:embed="rId16"/>
+                    <a:stretch>
+                      <a:fillRect/>
+                    </a:stretch>
+                  </pic:blipFill>
+                  <pic:spPr>
+                    <a:xfrm>
+                      <a:off x="0" y="0"/>
+                      <a:ext cx="5303520" cy="3756660"/>
+                    </a:xfrm>
+                    <a:prstGeom prst="rect"/>
+                  </pic:spPr>
+                </pic:pic>
+              </a:graphicData>
+            </a:graphic>
+          </wp:inline>
+        </w:drawing>
+      </w:r>
+    </w:p>
+    <w:p>
+      <w:pPr>
+        <w:spacing w:after="240"/>
+        <w:jc w:val="center"/>
+      </w:pPr>
+      <w:r>
+        <w:rPr>
+          <w:i/>
+          <w:sz w:val="21"/>
+        </w:rPr>
+        <w:t>Figure 7: SmartIsolator unit test results verifying target isolation and scan exception logic.</w:t>
+      </w:r>
+    </w:p>
+    <w:p>
+      <w:pPr>
         <w:keepNext/>
         <w:spacing w:before="200" w:after="120"/>
       </w:pPr>
@@ -5345,6 +5716,165 @@
       </w:r>
       <w:r>
         <w:t xml:space="preserve"> (system configuration, ML monitor control, and database reset).</w:t>
+      </w:r>
+    </w:p>
+    <w:p>
+      <w:pPr>
+        <w:spacing w:before="200" w:after="80"/>
+        <w:jc w:val="center"/>
+      </w:pPr>
+      <w:r>
+        <w:drawing>
+          <wp:inline xmlns:a="http://schemas.openxmlformats.org/drawingml/2006/main" xmlns:pic="http://schemas.openxmlformats.org/drawingml/2006/picture">
+            <wp:extent cx="5303520" cy="2519172"/>
+            <wp:docPr id="9" name="Picture 9"/>
+            <wp:cNvGraphicFramePr>
+              <a:graphicFrameLocks noChangeAspect="1"/>
+            </wp:cNvGraphicFramePr>
+            <a:graphic>
+              <a:graphicData uri="http://schemas.openxmlformats.org/drawingml/2006/picture">
+                <pic:pic>
+                  <pic:nvPicPr>
+                    <pic:cNvPr id="0" name="dashboard_react.png"/>
+                    <pic:cNvPicPr/>
+                  </pic:nvPicPr>
+                  <pic:blipFill>
+                    <a:blip r:embed="rId17"/>
+                    <a:stretch>
+                      <a:fillRect/>
+                    </a:stretch>
+                  </pic:blipFill>
+                  <pic:spPr>
+                    <a:xfrm>
+                      <a:off x="0" y="0"/>
+                      <a:ext cx="5303520" cy="2519172"/>
+                    </a:xfrm>
+                    <a:prstGeom prst="rect"/>
+                  </pic:spPr>
+                </pic:pic>
+              </a:graphicData>
+            </a:graphic>
+          </wp:inline>
+        </w:drawing>
+      </w:r>
+    </w:p>
+    <w:p>
+      <w:pPr>
+        <w:spacing w:after="240"/>
+        <w:jc w:val="center"/>
+      </w:pPr>
+      <w:r>
+        <w:rPr>
+          <w:i/>
+          <w:sz w:val="21"/>
+        </w:rPr>
+        <w:t>Figure 8: React SOC Dashboard main interface showing threat statistics and gauges.</w:t>
+      </w:r>
+    </w:p>
+    <w:p>
+      <w:pPr>
+        <w:spacing w:before="200" w:after="80"/>
+        <w:jc w:val="center"/>
+      </w:pPr>
+      <w:r>
+        <w:drawing>
+          <wp:inline xmlns:a="http://schemas.openxmlformats.org/drawingml/2006/main" xmlns:pic="http://schemas.openxmlformats.org/drawingml/2006/picture">
+            <wp:extent cx="5303520" cy="2519172"/>
+            <wp:docPr id="10" name="Picture 10"/>
+            <wp:cNvGraphicFramePr>
+              <a:graphicFrameLocks noChangeAspect="1"/>
+            </wp:cNvGraphicFramePr>
+            <a:graphic>
+              <a:graphicData uri="http://schemas.openxmlformats.org/drawingml/2006/picture">
+                <pic:pic>
+                  <pic:nvPicPr>
+                    <pic:cNvPr id="0" name="isolated_react.png"/>
+                    <pic:cNvPicPr/>
+                  </pic:nvPicPr>
+                  <pic:blipFill>
+                    <a:blip r:embed="rId18"/>
+                    <a:stretch>
+                      <a:fillRect/>
+                    </a:stretch>
+                  </pic:blipFill>
+                  <pic:spPr>
+                    <a:xfrm>
+                      <a:off x="0" y="0"/>
+                      <a:ext cx="5303520" cy="2519172"/>
+                    </a:xfrm>
+                    <a:prstGeom prst="rect"/>
+                  </pic:spPr>
+                </pic:pic>
+              </a:graphicData>
+            </a:graphic>
+          </wp:inline>
+        </w:drawing>
+      </w:r>
+    </w:p>
+    <w:p>
+      <w:pPr>
+        <w:spacing w:after="240"/>
+        <w:jc w:val="center"/>
+      </w:pPr>
+      <w:r>
+        <w:rPr>
+          <w:i/>
+          <w:sz w:val="21"/>
+        </w:rPr>
+        <w:t>Figure 9: Dashboard page containing currently isolated threat source and compromised containers.</w:t>
+      </w:r>
+    </w:p>
+    <w:p>
+      <w:pPr>
+        <w:spacing w:before="200" w:after="80"/>
+        <w:jc w:val="center"/>
+      </w:pPr>
+      <w:r>
+        <w:drawing>
+          <wp:inline xmlns:a="http://schemas.openxmlformats.org/drawingml/2006/main" xmlns:pic="http://schemas.openxmlformats.org/drawingml/2006/picture">
+            <wp:extent cx="5303520" cy="7551992"/>
+            <wp:docPr id="11" name="Picture 11"/>
+            <wp:cNvGraphicFramePr>
+              <a:graphicFrameLocks noChangeAspect="1"/>
+            </wp:cNvGraphicFramePr>
+            <a:graphic>
+              <a:graphicData uri="http://schemas.openxmlformats.org/drawingml/2006/picture">
+                <pic:pic>
+                  <pic:nvPicPr>
+                    <pic:cNvPr id="0" name="anomalies_react.png"/>
+                    <pic:cNvPicPr/>
+                  </pic:nvPicPr>
+                  <pic:blipFill>
+                    <a:blip r:embed="rId19"/>
+                    <a:stretch>
+                      <a:fillRect/>
+                    </a:stretch>
+                  </pic:blipFill>
+                  <pic:spPr>
+                    <a:xfrm>
+                      <a:off x="0" y="0"/>
+                      <a:ext cx="5303520" cy="7551992"/>
+                    </a:xfrm>
+                    <a:prstGeom prst="rect"/>
+                  </pic:spPr>
+                </pic:pic>
+              </a:graphicData>
+            </a:graphic>
+          </wp:inline>
+        </w:drawing>
+      </w:r>
+    </w:p>
+    <w:p>
+      <w:pPr>
+        <w:spacing w:after="240"/>
+        <w:jc w:val="center"/>
+      </w:pPr>
+      <w:r>
+        <w:rPr>
+          <w:i/>
+          <w:sz w:val="21"/>
+        </w:rPr>
+        <w:t>Figure 10: Anomalies Detected logs table showing individual event alerts and ML scores.</w:t>
       </w:r>
     </w:p>
     <w:p>
@@ -9850,18 +10380,55 @@
     </w:p>
     <w:p>
       <w:pPr>
-        <w:spacing w:before="160" w:after="160"/>
+        <w:spacing w:before="200" w:after="80"/>
         <w:jc w:val="center"/>
       </w:pPr>
       <w:r>
+        <w:drawing>
+          <wp:inline xmlns:a="http://schemas.openxmlformats.org/drawingml/2006/main" xmlns:pic="http://schemas.openxmlformats.org/drawingml/2006/picture">
+            <wp:extent cx="5303520" cy="3756660"/>
+            <wp:docPr id="12" name="Picture 12"/>
+            <wp:cNvGraphicFramePr>
+              <a:graphicFrameLocks noChangeAspect="1"/>
+            </wp:cNvGraphicFramePr>
+            <a:graphic>
+              <a:graphicData uri="http://schemas.openxmlformats.org/drawingml/2006/picture">
+                <pic:pic>
+                  <pic:nvPicPr>
+                    <pic:cNvPr id="0" name="directory_tree.png"/>
+                    <pic:cNvPicPr/>
+                  </pic:nvPicPr>
+                  <pic:blipFill>
+                    <a:blip r:embed="rId20"/>
+                    <a:stretch>
+                      <a:fillRect/>
+                    </a:stretch>
+                  </pic:blipFill>
+                  <pic:spPr>
+                    <a:xfrm>
+                      <a:off x="0" y="0"/>
+                      <a:ext cx="5303520" cy="3756660"/>
+                    </a:xfrm>
+                    <a:prstGeom prst="rect"/>
+                  </pic:spPr>
+                </pic:pic>
+              </a:graphicData>
+            </a:graphic>
+          </wp:inline>
+        </w:drawing>
+      </w:r>
+    </w:p>
+    <w:p>
+      <w:pPr>
+        <w:spacing w:after="240"/>
+        <w:jc w:val="center"/>
+      </w:pPr>
+      <w:r>
         <w:rPr>
-          <w:b/>
-          <w:color w:val="787878"/>
-          <w:sz w:val="22"/>
+          <w:i/>
+          <w:sz w:val="21"/>
         </w:rPr>
-        <w:t>■ PLACEHOLDER FOR SCREENSHOT #11 ■</w:t>
-        <w:br/>
-        <w:t>([SCREENSHOT PLACEHOLDER #11: full file tree of C:\siem-soar-platform\ and C:\iot-ot-demo\ from the editor])</w:t>
+        <w:t>Figure 11: Workspace directory structure showing project folder organization.</w:t>
       </w:r>
     </w:p>
     <w:p>
@@ -9979,18 +10546,55 @@
     </w:p>
     <w:p>
       <w:pPr>
-        <w:spacing w:before="160" w:after="160"/>
+        <w:spacing w:before="200" w:after="80"/>
         <w:jc w:val="center"/>
       </w:pPr>
       <w:r>
+        <w:drawing>
+          <wp:inline xmlns:a="http://schemas.openxmlformats.org/drawingml/2006/main" xmlns:pic="http://schemas.openxmlformats.org/drawingml/2006/picture">
+            <wp:extent cx="5303520" cy="3756660"/>
+            <wp:docPr id="13" name="Picture 13"/>
+            <wp:cNvGraphicFramePr>
+              <a:graphicFrameLocks noChangeAspect="1"/>
+            </wp:cNvGraphicFramePr>
+            <a:graphic>
+              <a:graphicData uri="http://schemas.openxmlformats.org/drawingml/2006/picture">
+                <pic:pic>
+                  <pic:nvPicPr>
+                    <pic:cNvPr id="0" name="sqlite_browser.png"/>
+                    <pic:cNvPicPr/>
+                  </pic:nvPicPr>
+                  <pic:blipFill>
+                    <a:blip r:embed="rId21"/>
+                    <a:stretch>
+                      <a:fillRect/>
+                    </a:stretch>
+                  </pic:blipFill>
+                  <pic:spPr>
+                    <a:xfrm>
+                      <a:off x="0" y="0"/>
+                      <a:ext cx="5303520" cy="3756660"/>
+                    </a:xfrm>
+                    <a:prstGeom prst="rect"/>
+                  </pic:spPr>
+                </pic:pic>
+              </a:graphicData>
+            </a:graphic>
+          </wp:inline>
+        </w:drawing>
+      </w:r>
+    </w:p>
+    <w:p>
+      <w:pPr>
+        <w:spacing w:after="240"/>
+        <w:jc w:val="center"/>
+      </w:pPr>
+      <w:r>
         <w:rPr>
-          <w:b/>
-          <w:color w:val="787878"/>
-          <w:sz w:val="22"/>
+          <w:i/>
+          <w:sz w:val="21"/>
         </w:rPr>
-        <w:t>■ PLACEHOLDER FOR SCREENSHOT #12 ■</w:t>
-        <w:br/>
-        <w:t>([SCREENSHOT PLACEHOLDER #12: sample rows from siem_database.db events and isolations tables, opened in DB Browser for SQLite])</w:t>
+        <w:t>Figure 12: DB Browser for SQLite interface depicting generated alerts and isolation history.</w:t>
       </w:r>
     </w:p>
     <w:p>

</xml_diff>

<commit_message>
docs: add academic descriptions and figure references adjacent to screenshot placeholders
</commit_message>
<xml_diff>
--- a/docs/interim_report_complete.docx
+++ b/docs/interim_report_complete.docx
@@ -2501,6 +2501,15 @@
           <w:sz w:val="21"/>
         </w:rPr>
         <w:t>Figure 1: Complete SIEM+SOAR logical system architecture and communications topology.</w:t>
+      </w:r>
+    </w:p>
+    <w:p>
+      <w:pPr>
+        <w:spacing w:line="360" w:lineRule="auto" w:after="120"/>
+        <w:jc w:val="both"/>
+      </w:pPr>
+      <w:r>
+        <w:t>The overall system architecture of the SIEM+SOAR platform is illustrated in Figure 1. This system structure maps the flow of events from the virtualized device agents across the three network zones (OT, IoT, and DMZ) into the Scapy capture utility, through the feature extraction pipeline, and into the two-tier machine learning ensemble (comprising Isolation Forest and DBSCAN). The resulting scores are passed to the SmartIsolator, which coordinates micro-segmentation enforcements, while the Flask API and WebSocket server push real-time alerts to the SOC dashboard.</w:t>
       </w:r>
     </w:p>
     <w:p>
@@ -4942,6 +4951,15 @@
     </w:p>
     <w:p>
       <w:pPr>
+        <w:spacing w:line="360" w:lineRule="auto" w:after="120"/>
+        <w:jc w:val="both"/>
+      </w:pPr>
+      <w:r>
+        <w:t>As shown in Figure 2, the status of the virtual environment is verified using Docker CLI commands, confirming that all twelve platform containers—including the three Wazuh cluster components and nine device agents—are active and running.</w:t>
+      </w:r>
+    </w:p>
+    <w:p>
+      <w:pPr>
         <w:spacing w:before="200" w:after="80"/>
         <w:jc w:val="center"/>
       </w:pPr>
@@ -4995,6 +5013,45 @@
     </w:p>
     <w:p>
       <w:pPr>
+        <w:spacing w:line="360" w:lineRule="auto" w:after="120"/>
+        <w:jc w:val="both"/>
+      </w:pPr>
+      <w:r>
+        <w:t>Figure 3 illustrates the configuration of the network bridges. The three isolated networks (</w:t>
+      </w:r>
+      <w:r>
+        <w:rPr>
+          <w:rFonts w:ascii="Consolas" w:hAnsi="Consolas"/>
+          <w:color w:val="C7254E"/>
+        </w:rPr>
+        <w:t>siem-soar-platform_ot-network</w:t>
+      </w:r>
+      <w:r>
+        <w:t xml:space="preserve"> for Modbus devices, </w:t>
+      </w:r>
+      <w:r>
+        <w:rPr>
+          <w:rFonts w:ascii="Consolas" w:hAnsi="Consolas"/>
+          <w:color w:val="C7254E"/>
+        </w:rPr>
+        <w:t>siem-soar-platform_iot-network</w:t>
+      </w:r>
+      <w:r>
+        <w:t xml:space="preserve"> for MQTT telemetry, and </w:t>
+      </w:r>
+      <w:r>
+        <w:rPr>
+          <w:rFonts w:ascii="Consolas" w:hAnsi="Consolas"/>
+          <w:color w:val="C7254E"/>
+        </w:rPr>
+        <w:t>siem-soar-platform_dmz-network</w:t>
+      </w:r>
+      <w:r>
+        <w:t xml:space="preserve"> for public-facing gateway services) ensure that traffic is segregated by default according to functional zones.</w:t>
+      </w:r>
+    </w:p>
+    <w:p>
+      <w:pPr>
         <w:keepNext/>
         <w:spacing w:before="200" w:after="120"/>
       </w:pPr>
@@ -5139,6 +5196,15 @@
     </w:p>
     <w:p>
       <w:pPr>
+        <w:spacing w:line="360" w:lineRule="auto" w:after="120"/>
+        <w:jc w:val="both"/>
+      </w:pPr>
+      <w:r>
+        <w:t>The console output of the traffic capture script is shown in Figure 4. The sniffer tracks network packets and groups them into 10-second sliding windows, displaying telemetry metrics such as packet rate, scan rate, and write ratio per device to verify active traffic aggregation.</w:t>
+      </w:r>
+    </w:p>
+    <w:p>
+      <w:pPr>
         <w:spacing w:before="200" w:after="80"/>
         <w:jc w:val="center"/>
       </w:pPr>
@@ -5192,6 +5258,25 @@
     </w:p>
     <w:p>
       <w:pPr>
+        <w:spacing w:line="360" w:lineRule="auto" w:after="120"/>
+        <w:jc w:val="both"/>
+      </w:pPr>
+      <w:r>
+        <w:t>Figure 5 shows the format of the generated behavioral dataset (</w:t>
+      </w:r>
+      <w:r>
+        <w:rPr>
+          <w:rFonts w:ascii="Consolas" w:hAnsi="Consolas"/>
+          <w:color w:val="C7254E"/>
+        </w:rPr>
+        <w:t>clustering_dataset.csv</w:t>
+      </w:r>
+      <w:r>
+        <w:t>), showcasing the columns and aggregated feature statistics for each device profile across the 30-window sliding session.</w:t>
+      </w:r>
+    </w:p>
+    <w:p>
+      <w:pPr>
         <w:keepNext/>
         <w:spacing w:before="200" w:after="120"/>
       </w:pPr>
@@ -5348,6 +5433,15 @@
     </w:p>
     <w:p>
       <w:pPr>
+        <w:spacing w:line="360" w:lineRule="auto" w:after="120"/>
+        <w:jc w:val="both"/>
+      </w:pPr>
+      <w:r>
+        <w:t>Figure 6 displays the terminal logs from running the model training pipeline. The logs verify the fitment of the Isolation Forest and DBSCAN algorithms, including the optimization process and the automatic epsilon distance threshold calculation.</w:t>
+      </w:r>
+    </w:p>
+    <w:p>
+      <w:pPr>
         <w:spacing w:before="200" w:after="80"/>
         <w:jc w:val="center"/>
       </w:pPr>
@@ -5401,6 +5495,15 @@
     </w:p>
     <w:p>
       <w:pPr>
+        <w:spacing w:line="360" w:lineRule="auto" w:after="120"/>
+        <w:jc w:val="both"/>
+      </w:pPr>
+      <w:r>
+        <w:t>To assess model accuracy, the per-device anomaly scores are graphed. As shown in Figure 13, the two-tier ensemble achieves a clear and complete classification gap, separating the attacker node (score of 1.0) from all benign device nodes (maximum benign score of 0.079).</w:t>
+      </w:r>
+    </w:p>
+    <w:p>
+      <w:pPr>
         <w:keepNext/>
         <w:spacing w:before="200" w:after="120"/>
       </w:pPr>
@@ -5624,6 +5727,15 @@
     </w:p>
     <w:p>
       <w:pPr>
+        <w:spacing w:line="360" w:lineRule="auto" w:after="120"/>
+        <w:jc w:val="both"/>
+      </w:pPr>
+      <w:r>
+        <w:t>The security policy enforcement is validated through dedicated test suites. As shown in the unit test logs in Figure 7, the isolation logic successfully quarantined the attacker IP and the compromised write target while correctly bypassing devices that were only scanned, verifying the precision of the SOAR state machine.</w:t>
+      </w:r>
+    </w:p>
+    <w:p>
+      <w:pPr>
         <w:keepNext/>
         <w:spacing w:before="200" w:after="120"/>
       </w:pPr>
@@ -5773,6 +5885,15 @@
     </w:p>
     <w:p>
       <w:pPr>
+        <w:spacing w:line="360" w:lineRule="auto" w:after="120"/>
+        <w:jc w:val="both"/>
+      </w:pPr>
+      <w:r>
+        <w:t>Figure 8 presents the main React-based SOC dashboard. This interface provides an overall security overview, containing key metrics such as active alerts, the system threat level gauge, current isolations, and a live topological graph of the network zones.</w:t>
+      </w:r>
+    </w:p>
+    <w:p>
+      <w:pPr>
         <w:spacing w:before="200" w:after="80"/>
         <w:jc w:val="center"/>
       </w:pPr>
@@ -5826,6 +5947,15 @@
     </w:p>
     <w:p>
       <w:pPr>
+        <w:spacing w:line="360" w:lineRule="auto" w:after="120"/>
+        <w:jc w:val="both"/>
+      </w:pPr>
+      <w:r>
+        <w:t>The isolated devices interface displays the physical containment status of compromised devices. As illustrated in Figure 9, the table registers each quarantined container, detailing its IP address, host network zone, isolation reason (e.g., threat source or compromised target), and timestamp.</w:t>
+      </w:r>
+    </w:p>
+    <w:p>
+      <w:pPr>
         <w:spacing w:before="200" w:after="80"/>
         <w:jc w:val="center"/>
       </w:pPr>
@@ -5875,6 +6005,15 @@
           <w:sz w:val="21"/>
         </w:rPr>
         <w:t>Figure 10: Anomalies Detected logs table showing individual event alerts and ML scores.</w:t>
+      </w:r>
+    </w:p>
+    <w:p>
+      <w:pPr>
+        <w:spacing w:line="360" w:lineRule="auto" w:after="120"/>
+        <w:jc w:val="both"/>
+      </w:pPr>
+      <w:r>
+        <w:t>Anomalous events identified by the two-tier machine learning ensemble are logged separately for audit. Figure 10 shows the anomaly detection feed, showing individual device anomalous scores, detection confidence, and the specific classification assigned by the ensemble models.</w:t>
       </w:r>
     </w:p>
     <w:p>
@@ -10433,6 +10572,15 @@
     </w:p>
     <w:p>
       <w:pPr>
+        <w:spacing w:line="360" w:lineRule="auto" w:after="120"/>
+        <w:jc w:val="both"/>
+      </w:pPr>
+      <w:r>
+        <w:t>Figure 11 outlines the full workspace layout of the repository. This structure highlights the division of labor between backend API files, frontend React components, machine learning pipelines, and network enforcement scripts.</w:t>
+      </w:r>
+    </w:p>
+    <w:p>
+      <w:pPr>
         <w:keepNext/>
         <w:spacing w:before="200" w:after="120"/>
       </w:pPr>
@@ -10595,6 +10743,55 @@
           <w:sz w:val="21"/>
         </w:rPr>
         <w:t>Figure 12: DB Browser for SQLite interface depicting generated alerts and isolation history.</w:t>
+      </w:r>
+    </w:p>
+    <w:p>
+      <w:pPr>
+        <w:spacing w:line="360" w:lineRule="auto" w:after="120"/>
+        <w:jc w:val="both"/>
+      </w:pPr>
+      <w:r>
+        <w:t xml:space="preserve">Figure 12 shows the raw database tables accessed via a graphical SQLite viewer. This view provides verification of the persistent records in the </w:t>
+      </w:r>
+      <w:r>
+        <w:rPr>
+          <w:rFonts w:ascii="Consolas" w:hAnsi="Consolas"/>
+          <w:color w:val="C7254E"/>
+        </w:rPr>
+        <w:t>events</w:t>
+      </w:r>
+      <w:r>
+        <w:t xml:space="preserve">, </w:t>
+      </w:r>
+      <w:r>
+        <w:rPr>
+          <w:rFonts w:ascii="Consolas" w:hAnsi="Consolas"/>
+          <w:color w:val="C7254E"/>
+        </w:rPr>
+        <w:t>anomalies</w:t>
+      </w:r>
+      <w:r>
+        <w:t xml:space="preserve">, </w:t>
+      </w:r>
+      <w:r>
+        <w:rPr>
+          <w:rFonts w:ascii="Consolas" w:hAnsi="Consolas"/>
+          <w:color w:val="C7254E"/>
+        </w:rPr>
+        <w:t>incidents</w:t>
+      </w:r>
+      <w:r>
+        <w:t xml:space="preserve">, and </w:t>
+      </w:r>
+      <w:r>
+        <w:rPr>
+          <w:rFonts w:ascii="Consolas" w:hAnsi="Consolas"/>
+          <w:color w:val="C7254E"/>
+        </w:rPr>
+        <w:t>isolations</w:t>
+      </w:r>
+      <w:r>
+        <w:t xml:space="preserve"> tables during live operation.</w:t>
       </w:r>
     </w:p>
     <w:p>

</xml_diff>